<commit_message>
fix(veille): quatre corrections sur la veille SERAFIN-PH du 26/08
- Les trois « sources primaires » étaient en bleu souligné sans être
  des liens : aucune relation hypertexte, aucune URL en clair. Les
  trois adresses ont été retrouvées, testées (200) et posées en vrais
  liens (handicap.gouv.fr, bulletins officiels, cnsa.fr).
- Point de vigilance n° 4 : la garantie de non-baisse en convergence
  négative était énoncée comme acquise. Le texte distingue désormais
  la résorption sur huit ans, établie, de l'engagement ministériel non
  documenté qu'aucune des 21 veilles n'a pu rattacher à un texte.
- Décompte des sources rétabli : 5 tentées, 4 consultées dont 3
  contributrices, 1 inaccessible.
- Réserve ajoutée sur les 16 Md€ : le titre de l'instruction 2026/80
  vise les ESMS handicap ET personnes âgées.

Formulations d'origine conservées dans le journal des corrections.

Co-Authored-By: Claude Opus 5 <noreply@anthropic.com>
</commit_message>
<xml_diff>
--- a/sources/veille/2026-08-26_veille_SERAFIN-PH.docx
+++ b/sources/veille/2026-08-26_veille_SERAFIN-PH.docx
@@ -607,7 +607,7 @@
           <w:sz w:val="18"/>
           <w:szCs w:val="18"/>
         </w:rPr>
-        <w:t xml:space="preserve">Note : 3 sources ✅ effectivement consultées et dont au moins une donnée est reprise ci-dessous | 1 source ⛔ inaccessible (ATIH, HTTP 403) | Les outils WebSearch et WebFetch ne sont pas des sources documentaires et n'apparaissent pas dans ce décompte.</w:t>
+        <w:t xml:space="preserve">Note : 5 sources tentées | 4 ✅ consultées, dont 3 contributrices (la FHF n'a rien apporté dans la fenêtre) | 1 source ⛔ inaccessible (ATIH, HTTP 403) | Les outils WebSearch et WebFetch ne sont pas des sources documentaires et n'apparaissent pas dans ce décompte.</w:t>
       </w:r>
     </w:p>
     <w:p>
@@ -1323,16 +1323,18 @@
         </w:rPr>
         <w:t xml:space="preserve">Source primaire : </w:t>
       </w:r>
-      <w:r>
-        <w:rPr>
-          <w:rFonts w:ascii="Calibri" w:cs="Calibri" w:eastAsia="Calibri" w:hAnsi="Calibri"/>
-          <w:color w:val="1B3A6B"/>
-          <w:sz w:val="20"/>
-          <w:szCs w:val="20"/>
-          <w:u w:val="single"/>
-        </w:rPr>
-        <w:t xml:space="preserve">handicap.gouv.fr — 14e réunion du comité stratégique</w:t>
-      </w:r>
+      <w:hyperlink w:history="1" r:id="rIdhandicapgouvcomite14">
+        <w:r>
+          <w:rPr>
+            <w:rFonts w:ascii="Calibri" w:cs="Calibri" w:eastAsia="Calibri" w:hAnsi="Calibri"/>
+            <w:color w:val="1155CC"/>
+            <w:sz w:val="20"/>
+            <w:szCs w:val="20"/>
+            <w:u w:val="single"/>
+          </w:rPr>
+          <w:t xml:space="preserve">handicap.gouv.fr — 14e réunion du comité stratégique</w:t>
+        </w:r>
+      </w:hyperlink>
     </w:p>
     <w:p>
       <w:pPr>
@@ -1382,7 +1384,7 @@
           <w:sz w:val="22"/>
           <w:szCs w:val="22"/>
         </w:rPr>
-        <w:t xml:space="preserve">Dotation globale ESSMS personnes handicapées 2026 : 16 milliards d'euros (taux de croissance 2,5 %).</w:t>
+        <w:t xml:space="preserve">Dotation globale ESSMS personnes handicapées 2026 : 16 milliards d'euros (taux de croissance 2,5 %). ⚠️ Le titre complet de l'instruction couvre les ESMS accueillant des personnes en situation de handicap ET des personnes âgées : vérifier, avant de réutiliser ce chiffre, qu'il porte bien sur le seul champ PH et non sur l'ensemble PA+PH — d'autres relais de presse annoncent une progression d'ensemble différente.</w:t>
       </w:r>
     </w:p>
     <w:p>
@@ -1442,16 +1444,18 @@
         </w:rPr>
         <w:t xml:space="preserve">Source primaire : </w:t>
       </w:r>
-      <w:r>
-        <w:rPr>
-          <w:rFonts w:ascii="Calibri" w:cs="Calibri" w:eastAsia="Calibri" w:hAnsi="Calibri"/>
-          <w:color w:val="1B3A6B"/>
-          <w:sz w:val="20"/>
-          <w:szCs w:val="20"/>
-          <w:u w:val="single"/>
-        </w:rPr>
-        <w:t xml:space="preserve">Bulletins officiels — Instruction n°2026/80 du 16 juin 2026</w:t>
-      </w:r>
+      <w:hyperlink w:history="1" r:id="rIdbulletinsofficiels80">
+        <w:r>
+          <w:rPr>
+            <w:rFonts w:ascii="Calibri" w:cs="Calibri" w:eastAsia="Calibri" w:hAnsi="Calibri"/>
+            <w:color w:val="1155CC"/>
+            <w:sz w:val="20"/>
+            <w:szCs w:val="20"/>
+            <w:u w:val="single"/>
+          </w:rPr>
+          <w:t xml:space="preserve">Bulletins officiels — Instruction n°2026/80 du 16 juin 2026</w:t>
+        </w:r>
+      </w:hyperlink>
     </w:p>
     <w:p>
       <w:pPr>
@@ -1582,16 +1586,18 @@
         </w:rPr>
         <w:t xml:space="preserve">Source primaire : </w:t>
       </w:r>
-      <w:r>
-        <w:rPr>
-          <w:rFonts w:ascii="Calibri" w:cs="Calibri" w:eastAsia="Calibri" w:hAnsi="Calibri"/>
-          <w:color w:val="1B3A6B"/>
-          <w:sz w:val="20"/>
-          <w:szCs w:val="20"/>
-          <w:u w:val="single"/>
-        </w:rPr>
-        <w:t xml:space="preserve">cnsa.fr — Préparation du recueil PH 2026 (17 déc. 2025)</w:t>
-      </w:r>
+      <w:hyperlink w:history="1" r:id="rIdcnsarecueilph2026dec">
+        <w:r>
+          <w:rPr>
+            <w:rFonts w:ascii="Calibri" w:cs="Calibri" w:eastAsia="Calibri" w:hAnsi="Calibri"/>
+            <w:color w:val="1155CC"/>
+            <w:sz w:val="20"/>
+            <w:szCs w:val="20"/>
+            <w:u w:val="single"/>
+          </w:rPr>
+          <w:t xml:space="preserve">cnsa.fr — Préparation du recueil PH 2026 (17 déc. 2025)</w:t>
+        </w:r>
+      </w:hyperlink>
     </w:p>
     <w:p>
       <w:pPr>
@@ -1904,7 +1910,7 @@
                 <w:sz w:val="20"/>
                 <w:szCs w:val="20"/>
               </w:rPr>
-              <w:t xml:space="preserve">La période de convergence est de 8 ans (2027–2034). Une simulation défavorable ne se traduit pas par une perte immédiate de dotation — les structures à convergence négative ne voient pas leur financement baisser en dessous du socle actuel. Lire les simulations à la lumière de ce calendrier.</w:t>
+              <w:t xml:space="preserve">La période de convergence est de 8 ans (2027–2034). Une simulation défavorable ne se traduit pas par une perte immédiate de dotation : l'écart à la dotation cible est résorbé sur huit ans. ⚠️ En revanche, l'idée qu'une structure à convergence négative ne verrait JAMAIS son financement passer sous le socle actuel relève, en l'état, d'un engagement ministériel déclaré et non d'un mécanisme documenté : aucune des 21 veilles de ce dossier n'a identifié le texte qui le rendrait opposable à une ARS. À traiter comme une intention tant qu'une référence réglementaire n'est pas produite. Lire les simulations à la lumière de ce calendrier — et de cette réserve.</w:t>
             </w:r>
           </w:p>
         </w:tc>
@@ -2569,7 +2575,7 @@
           <w:sz w:val="18"/>
           <w:szCs w:val="18"/>
         </w:rPr>
-        <w:t xml:space="preserve">4 tentées | 3 ✅ consultées et contributrices | 1 ⛔ inaccessible (ATIH — HTTP 403)</w:t>
+        <w:t xml:space="preserve">5 tentées | 4 ✅ consultées, dont 3 contributrices | 1 ⛔ inaccessible (ATIH — HTTP 403)</w:t>
       </w:r>
     </w:p>
     <w:p>
@@ -2620,6 +2626,182 @@
           <w:szCs w:val="18"/>
         </w:rPr>
         <w:t xml:space="preserve">Aucune — tous les éléments factuels proviennent des sources consultées lors de cette exécution. Les données hors fenêtre sont explicitement datées et placées en section « Rappel/Contexte ».</w:t>
+      </w:r>
+    </w:p>
+    <w:p>
+      <w:pPr>
+        <w:spacing w:after="120" w:before="280"/>
+      </w:pPr>
+      <w:r>
+        <w:rPr>
+          <w:rFonts w:ascii="Calibri" w:cs="Calibri" w:eastAsia="Calibri" w:hAnsi="Calibri"/>
+          <w:b/>
+          <w:bCs/>
+          <w:color w:val="1B3A6B"/>
+          <w:sz w:val="26"/>
+          <w:szCs w:val="26"/>
+        </w:rPr>
+        <w:t xml:space="preserve">📝 Journal des corrections</w:t>
+      </w:r>
+    </w:p>
+    <w:p>
+      <w:pPr>
+        <w:spacing w:after="80" w:before="80"/>
+      </w:pPr>
+      <w:r>
+        <w:rPr>
+          <w:rFonts w:ascii="Calibri" w:cs="Calibri" w:eastAsia="Calibri" w:hAnsi="Calibri"/>
+          <w:b w:val="false"/>
+          <w:bCs w:val="false"/>
+          <w:color w:val="1F2937"/>
+          <w:sz w:val="20"/>
+          <w:szCs w:val="20"/>
+        </w:rPr>
+        <w:t xml:space="preserve">Note produite et relue le 26/08/2026. Les corrections sont fondues dans le texte ci-dessus ; les formulations d'origine sont conservées ici.</w:t>
+      </w:r>
+    </w:p>
+    <w:p>
+      <w:pPr>
+        <w:spacing w:after="80" w:before="80"/>
+      </w:pPr>
+      <w:r>
+        <w:rPr>
+          <w:rFonts w:ascii="Calibri" w:cs="Calibri" w:eastAsia="Calibri" w:hAnsi="Calibri"/>
+          <w:b w:val="false"/>
+          <w:bCs w:val="false"/>
+          <w:color w:val="1F2937"/>
+          <w:sz w:val="20"/>
+          <w:szCs w:val="20"/>
+        </w:rPr>
+        <w:t xml:space="preserve">1. Trois « sources primaires » d'apparence cliquable, mais sans aucun lien.</w:t>
+      </w:r>
+    </w:p>
+    <w:p>
+      <w:pPr>
+        <w:spacing w:after="80" w:before="80"/>
+      </w:pPr>
+      <w:r>
+        <w:rPr>
+          <w:rFonts w:ascii="Calibri" w:cs="Calibri" w:eastAsia="Calibri" w:hAnsi="Calibri"/>
+          <w:b w:val="false"/>
+          <w:bCs w:val="false"/>
+          <w:color w:val="1F2937"/>
+          <w:sz w:val="20"/>
+          <w:szCs w:val="20"/>
+        </w:rPr>
+        <w:t xml:space="preserve">Les mentions « handicap.gouv.fr — 14e réunion du comité stratégique », « Bulletins officiels — Instruction n°2026/80 » et « cnsa.fr — Préparation du recueil PH 2026 » étaient écrites en bleu souligné, donc d'apparence cliquable, alors que le document ne contenait AUCUNE relation hypertexte et que les URL n'étaient pas davantage écrites en clair. Sur une note dont toute la valeur est la traçabilité, la source était nommée mais inatteignable. Les trois adresses ont été retrouvées et testées le 26/08/2026 (200), puis posées en vrais liens.</w:t>
+      </w:r>
+    </w:p>
+    <w:p>
+      <w:pPr>
+        <w:spacing w:after="80" w:before="80"/>
+      </w:pPr>
+      <w:r>
+        <w:rPr>
+          <w:rFonts w:ascii="Calibri" w:cs="Calibri" w:eastAsia="Calibri" w:hAnsi="Calibri"/>
+          <w:b w:val="false"/>
+          <w:bCs w:val="false"/>
+          <w:color w:val="1F2937"/>
+          <w:sz w:val="20"/>
+          <w:szCs w:val="20"/>
+        </w:rPr>
+        <w:t xml:space="preserve">2. Garantie de non-baisse en convergence négative — statut corrigé.</w:t>
+      </w:r>
+    </w:p>
+    <w:p>
+      <w:pPr>
+        <w:spacing w:after="80" w:before="80"/>
+      </w:pPr>
+      <w:r>
+        <w:rPr>
+          <w:rFonts w:ascii="Calibri" w:cs="Calibri" w:eastAsia="Calibri" w:hAnsi="Calibri"/>
+          <w:b w:val="false"/>
+          <w:bCs w:val="false"/>
+          <w:color w:val="1F2937"/>
+          <w:sz w:val="20"/>
+          <w:szCs w:val="20"/>
+        </w:rPr>
+        <w:t xml:space="preserve">Version initiale du point de vigilance n° 4 : « les structures à convergence négative ne voient pas leur financement baisser en dessous du socle actuel ». Énoncé comme acquis, dans une section non sourcée ligne à ligne. Le dossier de veille enregistre ce point depuis le printemps comme un engagement ministériel déclaré, dont aucune des 21 notes n'a identifié le texte qui le rendrait opposable à une ARS. Le passage distingue désormais ce qui est établi — la résorption de l'écart sur huit ans — de ce qui ne l'est pas.</w:t>
+      </w:r>
+    </w:p>
+    <w:p>
+      <w:pPr>
+        <w:spacing w:after="80" w:before="80"/>
+      </w:pPr>
+      <w:r>
+        <w:rPr>
+          <w:rFonts w:ascii="Calibri" w:cs="Calibri" w:eastAsia="Calibri" w:hAnsi="Calibri"/>
+          <w:b w:val="false"/>
+          <w:bCs w:val="false"/>
+          <w:color w:val="1F2937"/>
+          <w:sz w:val="20"/>
+          <w:szCs w:val="20"/>
+        </w:rPr>
+        <w:t xml:space="preserve">3. Décompte des sources incohérent.</w:t>
+      </w:r>
+    </w:p>
+    <w:p>
+      <w:pPr>
+        <w:spacing w:after="80" w:before="80"/>
+      </w:pPr>
+      <w:r>
+        <w:rPr>
+          <w:rFonts w:ascii="Calibri" w:cs="Calibri" w:eastAsia="Calibri" w:hAnsi="Calibri"/>
+          <w:b w:val="false"/>
+          <w:bCs w:val="false"/>
+          <w:color w:val="1F2937"/>
+          <w:sz w:val="20"/>
+          <w:szCs w:val="20"/>
+        </w:rPr>
+        <w:t xml:space="preserve">Version initiale : « 3 sources ✅ effectivement consultées » dans l'en-tête et « 4 tentées | 3 ✅ | 1 ⛔ » en pied de note, alors que le tableau liste cinq entrées : quatre consultées (handicap.gouv.fr, CNSA, Bulletins officiels, FHF) et une inaccessible (ATIH). La FHF, consultée sans rien apporter dans la fenêtre, disparaissait du total. Décompte rétabli : 5 tentées, 4 consultées dont 3 contributrices, 1 inaccessible.</w:t>
+      </w:r>
+    </w:p>
+    <w:p>
+      <w:pPr>
+        <w:spacing w:after="80" w:before="80"/>
+      </w:pPr>
+      <w:r>
+        <w:rPr>
+          <w:rFonts w:ascii="Calibri" w:cs="Calibri" w:eastAsia="Calibri" w:hAnsi="Calibri"/>
+          <w:b w:val="false"/>
+          <w:bCs w:val="false"/>
+          <w:color w:val="1F2937"/>
+          <w:sz w:val="20"/>
+          <w:szCs w:val="20"/>
+        </w:rPr>
+        <w:t xml:space="preserve">4. Périmètre de l'instruction 2026/80 — réserve ajoutée.</w:t>
+      </w:r>
+    </w:p>
+    <w:p>
+      <w:pPr>
+        <w:spacing w:after="80" w:before="80"/>
+      </w:pPr>
+      <w:r>
+        <w:rPr>
+          <w:rFonts w:ascii="Calibri" w:cs="Calibri" w:eastAsia="Calibri" w:hAnsi="Calibri"/>
+          <w:b w:val="false"/>
+          <w:bCs w:val="false"/>
+          <w:color w:val="1F2937"/>
+          <w:sz w:val="20"/>
+          <w:szCs w:val="20"/>
+        </w:rPr>
+        <w:t xml:space="preserve">Le chiffre de 16 Md€ est présenté comme la dotation « ESSMS personnes handicapées ». Or le titre complet de l'instruction, vérifié le 26/08/2026, vise les ESMS accueillant des personnes en situation de handicap ET des personnes âgées. Le chiffre n'a pas été modifié — il peut être exact pour le seul champ PH — mais une réserve invite à le confirmer avant réutilisation, d'autant que d'autres relais annoncent une progression d'ensemble différente.</w:t>
+      </w:r>
+    </w:p>
+    <w:p>
+      <w:pPr>
+        <w:spacing w:after="80" w:before="80"/>
+      </w:pPr>
+      <w:r>
+        <w:rPr>
+          <w:rFonts w:ascii="Calibri" w:cs="Calibri" w:eastAsia="Calibri" w:hAnsi="Calibri"/>
+          <w:b w:val="false"/>
+          <w:bCs w:val="false"/>
+          <w:color w:val="1F2937"/>
+          <w:sz w:val="20"/>
+          <w:szCs w:val="20"/>
+        </w:rPr>
+        <w:t xml:space="preserve">Vérifié lors de la relecture et inchangé : la date et la présidence de la 14e réunion du comité stratégique (23 mars 2026, Camille Galliard-Minier) ; le lancement du recueil au 30 mars 2026 ; le déploiement au 1er janvier 2027 pour le secteur enfants ; la convergence sur huit ans (2027-2034) ; les quelque 40 variables collectées via SIDOBA ; l'année blanche 2026 ; et le blocage HTTP 403 de l'ATIH, constant depuis le 17/06.</w:t>
       </w:r>
     </w:p>
     <w:sectPr>

</xml_diff>